<commit_message>
Dercy Parte 2: revisão
Co-Authored-By: Claude Opus 5.5 <noreply@anthropic.com>
Claude-Session: https://claude.ai/code/session_01MJjUEEZrxQDEUifKK2vj9g
</commit_message>
<xml_diff>
--- a/roteiros/dercy/Dercy_Parte2.docx
+++ b/roteiros/dercy/Dercy_Parte2.docx
@@ -63,7 +63,7 @@
         <w:rPr>
           <w:color w:val="000000"/>
         </w:rPr>
-        <w:t>Os dois formaram uma dupla e saíram pelo interior do Rio, de Minas e de São Paulo. Cantavam em cidades pequenas, em teatros improvisados e debaixo de lonas de circo.</w:t>
+        <w:t>Os dois formaram uma dupla e saíram pelo interior de três estados. Cantavam em teatros improvisados e debaixo de lonas de circo.</w:t>
       </w:r>
     </w:p>
     <w:p>
@@ -103,7 +103,7 @@
         <w:rPr>
           <w:color w:val="C00000"/>
         </w:rPr>
-        <w:t>O que aconteceu entre aqueles dois, longe dos palcos, Dercy guardou em silêncio por décadas. E quando finalmente teve coragem de falar, a frase que ela usou deixou muita gente sem saber o que dizer.</w:t>
+        <w:t>O que aconteceu entre aqueles dois, longe dos palcos, Dercy guardou em silêncio por décadas. E quando finalmente teve coragem de falar, usou uma palavra que quase ninguém esperava ouvir da boca dela.</w:t>
       </w:r>
     </w:p>
     <w:p>
@@ -119,7 +119,7 @@
         <w:rPr>
           <w:color w:val="000000"/>
         </w:rPr>
-        <w:t>Numa entrevista, já velha e famosa, ela contou como foi a primeira vez com Eugênio.</w:t>
+        <w:t>Numa entrevista, já idosa e famosa, ela contou como foi a primeira vez com Eugênio.</w:t>
       </w:r>
     </w:p>
     <w:p>
@@ -207,7 +207,7 @@
         <w:rPr>
           <w:color w:val="000000"/>
         </w:rPr>
-        <w:t>Ele foi para Atibaia, no interior de São Paulo, para se tratar. E deixou Dercy sozinha em São Paulo.</w:t>
+        <w:t>Ele foi se tratar em Atibaia, no interior paulista. E deixou Dercy sozinha na capital.</w:t>
       </w:r>
     </w:p>
     <w:p>
@@ -255,7 +255,7 @@
         <w:rPr>
           <w:color w:val="000000"/>
         </w:rPr>
-        <w:t>Ali, as regras eram outras. A plateia gritava, interrompia, provocava os atores no meio da cena.</w:t>
+        <w:t>Ali, as regras eram outras. A plateia gritava e provocava os atores no meio da cena.</w:t>
       </w:r>
     </w:p>
     <w:p>
@@ -375,7 +375,7 @@
         <w:rPr>
           <w:color w:val="000000"/>
         </w:rPr>
-        <w:t>Era um exportador de café de Minas Gerais. Rico. Influente.</w:t>
+        <w:t>Era um exportador de café de Minas Gerais. Um homem rico.</w:t>
       </w:r>
     </w:p>
     <w:p>

</xml_diff>